<commit_message>
Fix the SOW header leftover, the PR prefix and the division on generated documents
</commit_message>
<xml_diff>
--- a/backend/templates/sow_template.docx
+++ b/backend/templates/sow_template.docx
@@ -619,11 +619,6 @@
             <w:t>{{ project_title }}</w:t>
           </w:r>
         </w:p>
-        <w:p>
-          <w:r>
-            <w:t>{{ location_line }}</w:t>
-          </w:r>
-        </w:p>
       </w:tc>
       <w:tc>
         <w:tcPr>
@@ -715,55 +710,9 @@
               <w:sz w:val="24"/>
             </w:rPr>
           </w:pPr>
-        </w:p>
-        <w:p>
-          <w:pPr>
-            <w:pStyle w:val="TableParagraph"/>
-            <w:spacing w:line="237" w:lineRule="auto"/>
-            <w:ind w:left="4" w:right="450" w:firstLine="62"/>
-            <w:jc w:val="center"/>
-            <w:rPr>
-              <w:sz w:val="24"/>
-              <w:szCs w:val="24"/>
-            </w:rPr>
-          </w:pPr>
           <w:r>
-            <w:rPr>
-              <w:sz w:val="24"/>
-              <w:szCs w:val="24"/>
-            </w:rPr>
-            <w:t xml:space="preserve">Installation of 3 phase 32A socket and exhaust connection for oven </w:t>
+            <w:t>{{ location_line }}</w:t>
           </w:r>
-        </w:p>
-        <w:p>
-          <w:pPr>
-            <w:pStyle w:val="TableParagraph"/>
-            <w:spacing w:line="237" w:lineRule="auto"/>
-            <w:ind w:left="4" w:right="450" w:firstLine="62"/>
-            <w:jc w:val="center"/>
-            <w:rPr>
-              <w:sz w:val="24"/>
-              <w:szCs w:val="24"/>
-            </w:rPr>
-          </w:pPr>
-          <w:r>
-            <w:rPr>
-              <w:sz w:val="24"/>
-              <w:szCs w:val="24"/>
-            </w:rPr>
-            <w:t>Building 4, Level 3, Rm# 4-3750.</w:t>
-          </w:r>
-        </w:p>
-        <w:p>
-          <w:pPr>
-            <w:pStyle w:val="TableParagraph"/>
-            <w:spacing w:line="237" w:lineRule="auto"/>
-            <w:ind w:left="4" w:right="450" w:firstLine="62"/>
-            <w:jc w:val="center"/>
-            <w:rPr>
-              <w:sz w:val="24"/>
-            </w:rPr>
-          </w:pPr>
         </w:p>
       </w:tc>
       <w:tc>

</xml_diff>